<commit_message>
Fix factual errors found during review
- "ICLR 2026" → "Google Research, 2025" (arXiv not confirmed as ICLR)
- "~350x compute" → "~4000x" (corrected math)
- "Wan2.1-14B 40 layers" → "Wan2.1-1.3B 30 layers" (only verified 1.3B)
- Memory numbers: 88MB → 83MB, 1.29GB → 1.22GB (precise calculation)
- LLM kurtosis=900 marked as from turboquant_plus repo (not our experiment)
- Added article titles for social media sharing

Co-Authored-By: Claude Opus 4.6 (1M context) <noreply@anthropic.com>
</commit_message>
<xml_diff>
--- a/VedioQuant_Research_Report_CN.docx
+++ b/VedioQuant_Research_Report_CN.docx
@@ -2,7 +2,6 @@
 <file path=word/document.xml><?xml version="1.0" encoding="utf-8"?>
 <w:document xmlns:wpc="http://schemas.microsoft.com/office/word/2010/wordprocessingCanvas" xmlns:mo="http://schemas.microsoft.com/office/mac/office/2008/main" xmlns:mc="http://schemas.openxmlformats.org/markup-compatibility/2006" xmlns:mv="urn:schemas-microsoft-com:mac:vml" xmlns:o="urn:schemas-microsoft-com:office:office" xmlns:r="http://schemas.openxmlformats.org/officeDocument/2006/relationships" xmlns:m="http://schemas.openxmlformats.org/officeDocument/2006/math" xmlns:v="urn:schemas-microsoft-com:vml" xmlns:wp14="http://schemas.microsoft.com/office/word/2010/wordprocessingDrawing" xmlns:wp="http://schemas.openxmlformats.org/drawingml/2006/wordprocessingDrawing" xmlns:w10="urn:schemas-microsoft-com:office:word" xmlns:w="http://schemas.openxmlformats.org/wordprocessingml/2006/main" xmlns:w14="http://schemas.microsoft.com/office/word/2010/wordml" xmlns:wpg="http://schemas.microsoft.com/office/word/2010/wordprocessingGroup" xmlns:wpi="http://schemas.microsoft.com/office/word/2010/wordprocessingInk" xmlns:wne="http://schemas.microsoft.com/office/word/2006/wordml" xmlns:wps="http://schemas.microsoft.com/office/word/2010/wordprocessingShape" mc:Ignorable="w14 wp14">
   <w:body>
-    <w:p/>
     <w:p/>
     <w:p>
       <w:pPr>
@@ -45,6 +44,44 @@
     </w:p>
     <w:p/>
     <w:p>
+      <w:pPr>
+        <w:jc w:val="center"/>
+      </w:pPr>
+      <w:r>
+        <w:rPr>
+          <w:b/>
+          <w:color w:val="1A1A2E"/>
+          <w:sz w:val="44"/>
+        </w:rPr>
+        <w:t>我把Google的LLM黑科技用在了阿里Wan2.1视频模型上</w:t>
+      </w:r>
+    </w:p>
+    <w:p>
+      <w:pPr>
+        <w:jc w:val="center"/>
+      </w:pPr>
+      <w:r>
+        <w:rPr>
+          <w:b/>
+          <w:color w:val="FF6B6B"/>
+          <w:sz w:val="36"/>
+        </w:rPr>
+        <w:t>缓存直降10倍，效果比语言模型上还好——AI视频的算力账单要变天了</w:t>
+      </w:r>
+    </w:p>
+    <w:p>
+      <w:pPr>
+        <w:jc w:val="center"/>
+      </w:pPr>
+      <w:r>
+        <w:rPr>
+          <w:color w:val="666666"/>
+          <w:sz w:val="24"/>
+        </w:rPr>
+        <w:t>VedioQuant: TurboQuant × TeaCache 跨领域融合 | 在阿里Wan2.1上验证 | github.com/robin-ph/vedioquant</w:t>
+      </w:r>
+    </w:p>
+    <w:p>
       <w:r>
         <w:br w:type="page"/>
       </w:r>
@@ -54,7 +91,7 @@
         <w:pStyle w:val="Heading1"/>
       </w:pPr>
       <w:r>
-        <w:t>起因：一个视频创作者的好奇心</w:t>
+        <w:t>起因：一个视频模型爱好者的好奇心</w:t>
       </w:r>
     </w:p>
     <w:p>
@@ -64,7 +101,7 @@
     </w:p>
     <w:p>
       <w:r>
-        <w:t>作为一个对技术充满好奇的人，我想知道：为什么视频生成这么贵？一段 5 秒 720P 的视频，背后到底发生了多少计算？于是我开始深入研究视频扩散模型的推理流程。</w:t>
+        <w:t>作为一个视频模型爱好者，我非常好奇：为什么视频生成这么贵？一段 5 秒 720P 的视频，背后到底发生了多少计算？于是我开始深入研究视频扩散模型的推理流程，特别是阿里开源的 Wan2.1。</w:t>
       </w:r>
     </w:p>
     <w:p>
@@ -82,12 +119,12 @@
     </w:p>
     <w:p>
       <w:r>
-        <w:t>就在这时，我看到 Google 在 ICLR 2026 发表了 TurboQuant——把大语言模型 KV Cache 从 fp16 压缩到 3.5-bit，4× 压缩下余弦相似度仍有 0.95。核心 trick 是随机正交旋转让向量坐标高斯化。</w:t>
+        <w:t>就在这时，我看到 Google Research 发布了 TurboQuant（arXiv:2504.19874）——把大语言模型 KV Cache 从 fp16 压缩到 3.5-bit，4× 压缩下余弦相似度仍有 0.95。核心 trick 是随机正交旋转让向量坐标高斯化。</w:t>
       </w:r>
     </w:p>
     <w:p>
       <w:r>
-        <w:t>紧接着，有人用 Python 工程复现了 TurboQuant（turboquant_plus），在 Qwen3 上验证了旋转后峰度从 900 降到 2.9，141 个测试全部通过。这证明了算法工程上完全可行。</w:t>
+        <w:t>紧接着，有人用 Python 工程复现了 TurboQuant（turboquant_plus，GitHub 1.7k stars），在 Qwen3 上验证了旋转后峰度从 900 降到 2.9。这证明了算法工程上完全可行。</w:t>
       </w:r>
     </w:p>
     <w:p>
@@ -162,12 +199,12 @@
         <w:pStyle w:val="Heading2"/>
       </w:pPr>
       <w:r>
-        <w:t>原因 1：计算量是语言模型的 ~350 倍</w:t>
+        <w:t>原因 1：计算量是语言模型的数千倍</w:t>
       </w:r>
     </w:p>
     <w:p>
       <w:r>
-        <w:t>语言模型 KV Cache 线性增长，视频模型每步对所有 token 做全量注意力，重复 50 次。</w:t>
+        <w:t>语言模型 KV Cache 线性增长，视频模型每步对所有 token 做全量注意力，重复 50 次。粗略估算，视频模型的注意力计算量约为语言模型的 ~4000 倍。</w:t>
       </w:r>
     </w:p>
     <w:p>
@@ -230,7 +267,7 @@
       <w:r>
         <w:drawing>
           <wp:inline xmlns:a="http://schemas.openxmlformats.org/drawingml/2006/main" xmlns:pic="http://schemas.openxmlformats.org/drawingml/2006/picture">
-            <wp:extent cx="5029200" cy="1593800"/>
+            <wp:extent cx="5029200" cy="1606393"/>
             <wp:docPr id="4" name="Picture 4"/>
             <wp:cNvGraphicFramePr>
               <a:graphicFrameLocks noChangeAspect="1"/>
@@ -251,7 +288,7 @@
                   <pic:spPr>
                     <a:xfrm>
                       <a:off x="0" y="0"/>
-                      <a:ext cx="5029200" cy="1593800"/>
+                      <a:ext cx="5029200" cy="1606393"/>
                     </a:xfrm>
                     <a:prstGeom prst="rect"/>
                   </pic:spPr>
@@ -273,7 +310,7 @@
     </w:p>
     <w:p>
       <w:r>
-        <w:t>实验中的意外惊喜——视频特征的峰度只有 15（语言模型 900），旋转后几乎完美高斯（峰度 0.2 vs 理论 0.0），压缩质量比语言模型上还好。</w:t>
+        <w:t>实验中的意外惊喜——视频特征的峰度只有 15（据 turboquant_plus 报告，语言模型约 900），旋转后几乎完美高斯（峰度 0.2 vs 理论 0.0），压缩质量比语言模型上还好。</w:t>
       </w:r>
     </w:p>
     <w:p>
@@ -283,7 +320,7 @@
       <w:r>
         <w:drawing>
           <wp:inline xmlns:a="http://schemas.openxmlformats.org/drawingml/2006/main" xmlns:pic="http://schemas.openxmlformats.org/drawingml/2006/picture">
-            <wp:extent cx="5029200" cy="1593800"/>
+            <wp:extent cx="5029200" cy="1754949"/>
             <wp:docPr id="5" name="Picture 5"/>
             <wp:cNvGraphicFramePr>
               <a:graphicFrameLocks noChangeAspect="1"/>
@@ -304,7 +341,7 @@
                   <pic:spPr>
                     <a:xfrm>
                       <a:off x="0" y="0"/>
-                      <a:ext cx="5029200" cy="1593800"/>
+                      <a:ext cx="5029200" cy="1754949"/>
                     </a:xfrm>
                     <a:prstGeom prst="rect"/>
                   </pic:spPr>
@@ -838,7 +875,7 @@
           <w:color w:val="FF6B6B"/>
           <w:sz w:val="24"/>
         </w:rPr>
-        <w:t>30 层全缓存：13GB → 1.3GB，省出 12GB，24GB GPU 跑 720P 长视频。</w:t>
+        <w:t>30 层全缓存：13GB → 1.2GB，省出近 12GB，24GB GPU 跑 720P 长视频。</w:t>
       </w:r>
     </w:p>
     <w:p>
@@ -874,7 +911,7 @@
         <w:br/>
         <w:t>vedioquant.estimate_savings(height=720, width=1280, num_frames=81)</w:t>
         <w:br/>
-        <w:t># → fp32: 886MB, 3-bit: 83MB, saved: 803MB</w:t>
+        <w:t># → fp32: 886 MB, 3-bit: 83 MB, saved: 803 MB</w:t>
       </w:r>
     </w:p>
     <w:p/>
@@ -978,7 +1015,7 @@
         <w:pStyle w:val="ListBullet"/>
       </w:pPr>
       <w:r>
-        <w:t>TurboQuant: arXiv:2504.19874 (ICLR 2026)</w:t>
+        <w:t>TurboQuant: arXiv:2504.19874 (Google Research, 2025)</w:t>
       </w:r>
     </w:p>
     <w:p>

</xml_diff>